<commit_message>
Editing and displaying with docx.js
</commit_message>
<xml_diff>
--- a/templates/template.docx
+++ b/templates/template.docx
@@ -4,6 +4,7 @@
   <w:body>
     <w:p>
       <w:pPr>
+        <w:spacing w:after="120"/>
         <w:ind w:left="142" w:hanging="142"/>
       </w:pPr>
       <w:r>
@@ -13,440 +14,37 @@
         <mc:AlternateContent>
           <mc:Choice Requires="wps">
             <w:drawing>
-              <wp:anchor distT="0" distB="0" distL="114300" distR="114300" simplePos="0" relativeHeight="251658752" behindDoc="0" locked="0" layoutInCell="1" allowOverlap="1" wp14:anchorId="37F9B29B" wp14:editId="00638252">
+              <wp:anchor distT="0" distB="0" distL="114300" distR="114300" simplePos="0" relativeHeight="251655679" behindDoc="0" locked="0" layoutInCell="1" allowOverlap="1" wp14:anchorId="119A1C16" wp14:editId="283FA565">
                 <wp:simplePos x="0" y="0"/>
-                <wp:positionH relativeFrom="column">
-                  <wp:posOffset>-88900</wp:posOffset>
+                <wp:positionH relativeFrom="margin">
+                  <wp:posOffset>3623310</wp:posOffset>
                 </wp:positionH>
                 <wp:positionV relativeFrom="paragraph">
-                  <wp:posOffset>2349500</wp:posOffset>
+                  <wp:posOffset>441960</wp:posOffset>
                 </wp:positionV>
-                <wp:extent cx="3220278" cy="685800"/>
-                <wp:effectExtent l="0" t="0" r="0" b="0"/>
+                <wp:extent cx="2973705" cy="2466975"/>
+                <wp:effectExtent l="0" t="0" r="0" b="9525"/>
                 <wp:wrapNone/>
-                <wp:docPr id="3" name="Text Box 4"/>
-                <wp:cNvGraphicFramePr>
-                  <a:graphicFrameLocks xmlns:a="http://schemas.openxmlformats.org/drawingml/2006/main"/>
-                </wp:cNvGraphicFramePr>
+                <wp:docPr id="1960751003" name="Надпись 3"/>
+                <wp:cNvGraphicFramePr/>
                 <a:graphic xmlns:a="http://schemas.openxmlformats.org/drawingml/2006/main">
                   <a:graphicData uri="http://schemas.microsoft.com/office/word/2010/wordprocessingShape">
                     <wps:wsp>
-                      <wps:cNvSpPr txBox="1">
-                        <a:spLocks noChangeArrowheads="1"/>
-                      </wps:cNvSpPr>
-                      <wps:spPr bwMode="auto">
+                      <wps:cNvSpPr txBox="1"/>
+                      <wps:spPr>
                         <a:xfrm>
                           <a:off x="0" y="0"/>
-                          <a:ext cx="3220278" cy="685800"/>
-                        </a:xfrm>
-                        <a:prstGeom prst="rect">
-                          <a:avLst/>
-                        </a:prstGeom>
-                        <a:noFill/>
-                        <a:ln>
-                          <a:noFill/>
-                        </a:ln>
-                        <a:extLst>
-                          <a:ext uri="{909E8E84-426E-40DD-AFC4-6F175D3DCCD1}">
-                            <a14:hiddenFill xmlns:a14="http://schemas.microsoft.com/office/drawing/2010/main">
-                              <a:solidFill>
-                                <a:srgbClr val="FFFFFF"/>
-                              </a:solidFill>
-                            </a14:hiddenFill>
-                          </a:ext>
-                          <a:ext uri="{91240B29-F687-4F45-9708-019B960494DF}">
-                            <a14:hiddenLine xmlns:a14="http://schemas.microsoft.com/office/drawing/2010/main" w="9525">
-                              <a:solidFill>
-                                <a:srgbClr val="000000"/>
-                              </a:solidFill>
-                              <a:miter lim="800000"/>
-                              <a:headEnd/>
-                              <a:tailEnd/>
-                            </a14:hiddenLine>
-                          </a:ext>
-                        </a:extLst>
-                      </wps:spPr>
-                      <wps:txbx>
-                        <w:txbxContent>
-                          <w:p>
-                            <w:pPr>
-                              <w:tabs>
-                                <w:tab w:val="left" w:pos="2520"/>
-                              </w:tabs>
-                              <w:spacing w:line="360" w:lineRule="auto"/>
-                              <w:rPr>
-                                <w:i/>
-                              </w:rPr>
-                            </w:pPr>
-                            <w:r>
-                              <w:rPr>
-                                <w:i/>
-                              </w:rPr>
-                              <w:t xml:space="preserve">          </w:t>
-                            </w:r>
-                            <w:r>
-                              <w:rPr>
-                                <w:i/>
-                              </w:rPr>
-                              <w:t xml:space="preserve"> </w:t>
-                            </w:r>
-                            <w:r>
-                              <w:rPr>
-                                <w:i/>
-                              </w:rPr>
-                              <w:t>2</w:t>
-                            </w:r>
-                            <w:r>
-                              <w:rPr>
-                                <w:i/>
-                              </w:rPr>
-                              <w:t>6</w:t>
-                            </w:r>
-                            <w:r>
-                              <w:rPr>
-                                <w:i/>
-                              </w:rPr>
-                              <w:t>.</w:t>
-                            </w:r>
-                            <w:r>
-                              <w:rPr>
-                                <w:i/>
-                              </w:rPr>
-                              <w:t>03</w:t>
-                            </w:r>
-                            <w:r>
-                              <w:rPr>
-                                <w:i/>
-                              </w:rPr>
-                              <w:t>.202</w:t>
-                            </w:r>
-                            <w:r>
-                              <w:rPr>
-                                <w:i/>
-                              </w:rPr>
-                              <w:t>5</w:t>
-                            </w:r>
-                            <w:r>
-                              <w:rPr>
-                                <w:i/>
-                              </w:rPr>
-                              <w:tab/>
-                              <w:t xml:space="preserve">            КТ/Б-</w:t>
-                            </w:r>
-                            <w:r>
-                              <w:rPr>
-                                <w:i/>
-                              </w:rPr>
-                              <w:t>111</w:t>
-                            </w:r>
-                          </w:p>
-                          <w:p>
-                            <w:pPr>
-                              <w:spacing w:line="360" w:lineRule="auto"/>
-                              <w:rPr>
-                                <w:i/>
-                              </w:rPr>
-                            </w:pPr>
-                            <w:r>
-                              <w:rPr>
-                                <w:i/>
-                              </w:rPr>
-                              <w:t xml:space="preserve">                          </w:t>
-                            </w:r>
-                          </w:p>
-                          <w:p>
-                            <w:pPr>
-                              <w:jc w:val="center"/>
-                              <w:rPr>
-                                <w:i/>
-                              </w:rPr>
-                            </w:pPr>
-                          </w:p>
-                          <w:p>
-                            <w:pPr>
-                              <w:jc w:val="center"/>
-                              <w:rPr>
-                                <w:i/>
-                              </w:rPr>
-                            </w:pPr>
-                          </w:p>
-                          <w:p>
-                            <w:pPr>
-                              <w:jc w:val="center"/>
-                              <w:rPr>
-                                <w:i/>
-                              </w:rPr>
-                            </w:pPr>
-                          </w:p>
-                          <w:p>
-                            <w:pPr>
-                              <w:rPr>
-                                <w:i/>
-                              </w:rPr>
-                            </w:pPr>
-                          </w:p>
-                          <w:p>
-                            <w:pPr>
-                              <w:rPr>
-                                <w:i/>
-                              </w:rPr>
-                            </w:pPr>
-                            <w:r>
-                              <w:rPr>
-                                <w:i/>
-                              </w:rPr>
-                              <w:t xml:space="preserve">          </w:t>
-                            </w:r>
-                          </w:p>
-                          <w:p>
-                            <w:pPr>
-                              <w:jc w:val="center"/>
-                              <w:rPr>
-                                <w:i/>
-                              </w:rPr>
-                            </w:pPr>
-                          </w:p>
-                          <w:p>
-                            <w:pPr>
-                              <w:jc w:val="center"/>
-                              <w:rPr>
-                                <w:i/>
-                              </w:rPr>
-                            </w:pPr>
-                          </w:p>
-                        </w:txbxContent>
-                      </wps:txbx>
-                      <wps:bodyPr rot="0" vert="horz" wrap="square" lIns="91440" tIns="45720" rIns="91440" bIns="45720" anchor="t" anchorCtr="0" upright="1">
-                        <a:noAutofit/>
-                      </wps:bodyPr>
-                    </wps:wsp>
-                  </a:graphicData>
-                </a:graphic>
-                <wp14:sizeRelH relativeFrom="page">
-                  <wp14:pctWidth>0</wp14:pctWidth>
-                </wp14:sizeRelH>
-                <wp14:sizeRelV relativeFrom="page">
-                  <wp14:pctHeight>0</wp14:pctHeight>
-                </wp14:sizeRelV>
-              </wp:anchor>
-            </w:drawing>
-          </mc:Choice>
-          <mc:Fallback>
-            <w:pict>
-              <v:shapetype w14:anchorId="37F9B29B" id="_x0000_t202" coordsize="21600,21600" o:spt="202" path="m,l,21600r21600,l21600,xe">
-                <v:stroke joinstyle="miter"/>
-                <v:path gradientshapeok="t" o:connecttype="rect"/>
-              </v:shapetype>
-              <v:shape id="Text Box 4" o:spid="_x0000_s1026" type="#_x0000_t202" style="position:absolute;left:0;text-align:left;margin-left:-7pt;margin-top:185pt;width:253.55pt;height:54pt;z-index:251658752;visibility:visible;mso-wrap-style:square;mso-width-percent:0;mso-height-percent:0;mso-wrap-distance-left:9pt;mso-wrap-distance-top:0;mso-wrap-distance-right:9pt;mso-wrap-distance-bottom:0;mso-position-horizontal:absolute;mso-position-horizontal-relative:text;mso-position-vertical:absolute;mso-position-vertical-relative:text;mso-width-percent:0;mso-height-percent:0;mso-width-relative:page;mso-height-relative:page;v-text-anchor:top" o:gfxdata="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" filled="f" stroked="f">
-                <v:textbox>
-                  <w:txbxContent>
-                    <w:p>
-                      <w:pPr>
-                        <w:tabs>
-                          <w:tab w:val="left" w:pos="2520"/>
-                        </w:tabs>
-                        <w:spacing w:line="360" w:lineRule="auto"/>
-                        <w:rPr>
-                          <w:i/>
-                        </w:rPr>
-                      </w:pPr>
-                      <w:r>
-                        <w:rPr>
-                          <w:i/>
-                        </w:rPr>
-                        <w:t xml:space="preserve">          </w:t>
-                      </w:r>
-                      <w:r>
-                        <w:rPr>
-                          <w:i/>
-                        </w:rPr>
-                        <w:t xml:space="preserve"> </w:t>
-                      </w:r>
-                      <w:r>
-                        <w:rPr>
-                          <w:i/>
-                        </w:rPr>
-                        <w:t>2</w:t>
-                      </w:r>
-                      <w:r>
-                        <w:rPr>
-                          <w:i/>
-                        </w:rPr>
-                        <w:t>6</w:t>
-                      </w:r>
-                      <w:r>
-                        <w:rPr>
-                          <w:i/>
-                        </w:rPr>
-                        <w:t>.</w:t>
-                      </w:r>
-                      <w:r>
-                        <w:rPr>
-                          <w:i/>
-                        </w:rPr>
-                        <w:t>03</w:t>
-                      </w:r>
-                      <w:r>
-                        <w:rPr>
-                          <w:i/>
-                        </w:rPr>
-                        <w:t>.202</w:t>
-                      </w:r>
-                      <w:r>
-                        <w:rPr>
-                          <w:i/>
-                        </w:rPr>
-                        <w:t>5</w:t>
-                      </w:r>
-                      <w:r>
-                        <w:rPr>
-                          <w:i/>
-                        </w:rPr>
-                        <w:tab/>
-                        <w:t xml:space="preserve">            КТ/Б-</w:t>
-                      </w:r>
-                      <w:r>
-                        <w:rPr>
-                          <w:i/>
-                        </w:rPr>
-                        <w:t>111</w:t>
-                      </w:r>
-                    </w:p>
-                    <w:p>
-                      <w:pPr>
-                        <w:spacing w:line="360" w:lineRule="auto"/>
-                        <w:rPr>
-                          <w:i/>
-                        </w:rPr>
-                      </w:pPr>
-                      <w:r>
-                        <w:rPr>
-                          <w:i/>
-                        </w:rPr>
-                        <w:t xml:space="preserve">                          </w:t>
-                      </w:r>
-                    </w:p>
-                    <w:p>
-                      <w:pPr>
-                        <w:jc w:val="center"/>
-                        <w:rPr>
-                          <w:i/>
-                        </w:rPr>
-                      </w:pPr>
-                    </w:p>
-                    <w:p>
-                      <w:pPr>
-                        <w:jc w:val="center"/>
-                        <w:rPr>
-                          <w:i/>
-                        </w:rPr>
-                      </w:pPr>
-                    </w:p>
-                    <w:p>
-                      <w:pPr>
-                        <w:jc w:val="center"/>
-                        <w:rPr>
-                          <w:i/>
-                        </w:rPr>
-                      </w:pPr>
-                    </w:p>
-                    <w:p>
-                      <w:pPr>
-                        <w:rPr>
-                          <w:i/>
-                        </w:rPr>
-                      </w:pPr>
-                    </w:p>
-                    <w:p>
-                      <w:pPr>
-                        <w:rPr>
-                          <w:i/>
-                        </w:rPr>
-                      </w:pPr>
-                      <w:r>
-                        <w:rPr>
-                          <w:i/>
-                        </w:rPr>
-                        <w:t xml:space="preserve">          </w:t>
-                      </w:r>
-                    </w:p>
-                    <w:p>
-                      <w:pPr>
-                        <w:jc w:val="center"/>
-                        <w:rPr>
-                          <w:i/>
-                        </w:rPr>
-                      </w:pPr>
-                    </w:p>
-                    <w:p>
-                      <w:pPr>
-                        <w:jc w:val="center"/>
-                        <w:rPr>
-                          <w:i/>
-                        </w:rPr>
-                      </w:pPr>
-                    </w:p>
-                  </w:txbxContent>
-                </v:textbox>
-              </v:shape>
-            </w:pict>
-          </mc:Fallback>
-        </mc:AlternateContent>
-      </w:r>
-      <w:r>
-        <w:rPr>
-          <w:noProof/>
-        </w:rPr>
-        <mc:AlternateContent>
-          <mc:Choice Requires="wps">
-            <w:drawing>
-              <wp:anchor distT="0" distB="0" distL="114300" distR="114300" simplePos="0" relativeHeight="251657728" behindDoc="0" locked="0" layoutInCell="1" allowOverlap="1" wp14:anchorId="4A629B18" wp14:editId="3302FA27">
-                <wp:simplePos x="0" y="0"/>
-                <wp:positionH relativeFrom="margin">
-                  <wp:align>right</wp:align>
-                </wp:positionH>
-                <wp:positionV relativeFrom="paragraph">
-                  <wp:posOffset>413385</wp:posOffset>
-                </wp:positionV>
-                <wp:extent cx="2964180" cy="2871470"/>
-                <wp:effectExtent l="0" t="0" r="7620" b="5080"/>
-                <wp:wrapNone/>
-                <wp:docPr id="4" name="Rectangle 3"/>
-                <wp:cNvGraphicFramePr>
-                  <a:graphicFrameLocks xmlns:a="http://schemas.openxmlformats.org/drawingml/2006/main"/>
-                </wp:cNvGraphicFramePr>
-                <a:graphic xmlns:a="http://schemas.openxmlformats.org/drawingml/2006/main">
-                  <a:graphicData uri="http://schemas.microsoft.com/office/word/2010/wordprocessingShape">
-                    <wps:wsp>
-                      <wps:cNvSpPr>
-                        <a:spLocks noChangeArrowheads="1"/>
-                      </wps:cNvSpPr>
-                      <wps:spPr bwMode="auto">
-                        <a:xfrm>
-                          <a:off x="0" y="0"/>
-                          <a:ext cx="2964180" cy="2871470"/>
+                          <a:ext cx="2973705" cy="2466975"/>
                         </a:xfrm>
                         <a:prstGeom prst="rect">
                           <a:avLst/>
                         </a:prstGeom>
                         <a:solidFill>
-                          <a:srgbClr val="FFFFFF"/>
+                          <a:schemeClr val="lt1"/>
                         </a:solidFill>
-                        <a:ln>
+                        <a:ln w="6350">
                           <a:noFill/>
                         </a:ln>
-                        <a:extLst>
-                          <a:ext uri="{91240B29-F687-4F45-9708-019B960494DF}">
-                            <a14:hiddenLine xmlns:a14="http://schemas.microsoft.com/office/drawing/2010/main" w="9525">
-                              <a:solidFill>
-                                <a:srgbClr val="000000"/>
-                              </a:solidFill>
-                              <a:miter lim="800000"/>
-                              <a:headEnd/>
-                              <a:tailEnd/>
-                            </a14:hiddenLine>
-                          </a:ext>
-                        </a:extLst>
                       </wps:spPr>
                       <wps:txbx>
                         <w:txbxContent>
@@ -585,14 +183,7 @@
                                 <w:b/>
                                 <w:lang w:eastAsia="en-US"/>
                               </w:rPr>
-                              <w:t>Заместителю генерального директора ООО «</w:t>
-                            </w:r>
-                            <w:r>
-                              <w:rPr>
-                                <w:b/>
-                                <w:lang w:eastAsia="en-US"/>
-                              </w:rPr>
-                              <w:t xml:space="preserve">Мяу </w:t>
+                              <w:t xml:space="preserve">Заместителю генерального директора ООО «Мяу </w:t>
                             </w:r>
                             <w:proofErr w:type="spellStart"/>
                             <w:r>
@@ -631,14 +222,7 @@
                                 <w:b/>
                                 <w:lang w:eastAsia="en-US"/>
                               </w:rPr>
-                              <w:t>Иванов</w:t>
-                            </w:r>
-                            <w:r>
-                              <w:rPr>
-                                <w:b/>
-                                <w:lang w:eastAsia="en-US"/>
-                              </w:rPr>
-                              <w:t xml:space="preserve"> </w:t>
+                              <w:t xml:space="preserve">Иванов </w:t>
                             </w:r>
                             <w:proofErr w:type="gramStart"/>
                             <w:r>
@@ -646,51 +230,32 @@
                                 <w:b/>
                                 <w:lang w:eastAsia="en-US"/>
                               </w:rPr>
-                              <w:t>И</w:t>
-                            </w:r>
-                            <w:r>
-                              <w:rPr>
-                                <w:b/>
-                                <w:lang w:eastAsia="en-US"/>
-                              </w:rPr>
-                              <w:t>.</w:t>
-                            </w:r>
-                            <w:r>
-                              <w:rPr>
-                                <w:b/>
-                                <w:lang w:eastAsia="en-US"/>
-                              </w:rPr>
-                              <w:t>И</w:t>
-                            </w:r>
-                            <w:r>
-                              <w:rPr>
-                                <w:b/>
-                                <w:lang w:eastAsia="en-US"/>
-                              </w:rPr>
-                              <w:t>.</w:t>
+                              <w:t>И.И.</w:t>
                             </w:r>
                             <w:proofErr w:type="gramEnd"/>
                           </w:p>
                           <w:p>
                             <w:pPr>
                               <w:rPr>
-                                <w:b/>
-                                <w:bCs/>
+                                <w:lang w:val="en-US"/>
                               </w:rPr>
                             </w:pPr>
                           </w:p>
                         </w:txbxContent>
                       </wps:txbx>
-                      <wps:bodyPr rot="0" vert="horz" wrap="square" lIns="91440" tIns="45720" rIns="91440" bIns="45720" anchor="t" anchorCtr="0" upright="1">
+                      <wps:bodyPr rot="0" spcFirstLastPara="0" vertOverflow="overflow" horzOverflow="overflow" vert="horz" wrap="square" lIns="91440" tIns="45720" rIns="91440" bIns="45720" numCol="1" spcCol="0" rtlCol="0" fromWordArt="0" anchor="t" anchorCtr="0" forceAA="0" compatLnSpc="1">
+                        <a:prstTxWarp prst="textNoShape">
+                          <a:avLst/>
+                        </a:prstTxWarp>
                         <a:noAutofit/>
                       </wps:bodyPr>
                     </wps:wsp>
                   </a:graphicData>
                 </a:graphic>
-                <wp14:sizeRelH relativeFrom="page">
+                <wp14:sizeRelH relativeFrom="margin">
                   <wp14:pctWidth>0</wp14:pctWidth>
                 </wp14:sizeRelH>
-                <wp14:sizeRelV relativeFrom="page">
+                <wp14:sizeRelV relativeFrom="margin">
                   <wp14:pctHeight>0</wp14:pctHeight>
                 </wp14:sizeRelV>
               </wp:anchor>
@@ -698,7 +263,11 @@
           </mc:Choice>
           <mc:Fallback>
             <w:pict>
-              <v:rect w14:anchorId="4A629B18" id="Rectangle 3" o:spid="_x0000_s1027" style="position:absolute;left:0;text-align:left;margin-left:182.2pt;margin-top:32.55pt;width:233.4pt;height:226.1pt;z-index:251657728;visibility:visible;mso-wrap-style:square;mso-width-percent:0;mso-height-percent:0;mso-wrap-distance-left:9pt;mso-wrap-distance-top:0;mso-wrap-distance-right:9pt;mso-wrap-distance-bottom:0;mso-position-horizontal:right;mso-position-horizontal-relative:margin;mso-position-vertical:absolute;mso-position-vertical-relative:text;mso-width-percent:0;mso-height-percent:0;mso-width-relative:page;mso-height-relative:page;v-text-anchor:top" o:gfxdata="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" stroked="f">
+              <v:shapetype w14:anchorId="119A1C16" id="_x0000_t202" coordsize="21600,21600" o:spt="202" path="m,l,21600r21600,l21600,xe">
+                <v:stroke joinstyle="miter"/>
+                <v:path gradientshapeok="t" o:connecttype="rect"/>
+              </v:shapetype>
+              <v:shape id="Надпись 3" o:spid="_x0000_s1026" type="#_x0000_t202" style="position:absolute;left:0;text-align:left;margin-left:285.3pt;margin-top:34.8pt;width:234.15pt;height:194.25pt;z-index:251655679;visibility:visible;mso-wrap-style:square;mso-width-percent:0;mso-height-percent:0;mso-wrap-distance-left:9pt;mso-wrap-distance-top:0;mso-wrap-distance-right:9pt;mso-wrap-distance-bottom:0;mso-position-horizontal:absolute;mso-position-horizontal-relative:margin;mso-position-vertical:absolute;mso-position-vertical-relative:text;mso-width-percent:0;mso-height-percent:0;mso-width-relative:margin;mso-height-relative:margin;v-text-anchor:top" o:gfxdata="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" fillcolor="white [3201]" stroked="f" strokeweight=".5pt">
                 <v:textbox>
                   <w:txbxContent>
                     <w:p>
@@ -836,14 +405,7 @@
                           <w:b/>
                           <w:lang w:eastAsia="en-US"/>
                         </w:rPr>
-                        <w:t>Заместителю генерального директора ООО «</w:t>
-                      </w:r>
-                      <w:r>
-                        <w:rPr>
-                          <w:b/>
-                          <w:lang w:eastAsia="en-US"/>
-                        </w:rPr>
-                        <w:t xml:space="preserve">Мяу </w:t>
+                        <w:t xml:space="preserve">Заместителю генерального директора ООО «Мяу </w:t>
                       </w:r>
                       <w:proofErr w:type="spellStart"/>
                       <w:r>
@@ -882,14 +444,7 @@
                           <w:b/>
                           <w:lang w:eastAsia="en-US"/>
                         </w:rPr>
-                        <w:t>Иванов</w:t>
-                      </w:r>
-                      <w:r>
-                        <w:rPr>
-                          <w:b/>
-                          <w:lang w:eastAsia="en-US"/>
-                        </w:rPr>
-                        <w:t xml:space="preserve"> </w:t>
+                        <w:t xml:space="preserve">Иванов </w:t>
                       </w:r>
                       <w:proofErr w:type="gramStart"/>
                       <w:r>
@@ -897,43 +452,21 @@
                           <w:b/>
                           <w:lang w:eastAsia="en-US"/>
                         </w:rPr>
-                        <w:t>И</w:t>
-                      </w:r>
-                      <w:r>
-                        <w:rPr>
-                          <w:b/>
-                          <w:lang w:eastAsia="en-US"/>
-                        </w:rPr>
-                        <w:t>.</w:t>
-                      </w:r>
-                      <w:r>
-                        <w:rPr>
-                          <w:b/>
-                          <w:lang w:eastAsia="en-US"/>
-                        </w:rPr>
-                        <w:t>И</w:t>
-                      </w:r>
-                      <w:r>
-                        <w:rPr>
-                          <w:b/>
-                          <w:lang w:eastAsia="en-US"/>
-                        </w:rPr>
-                        <w:t>.</w:t>
+                        <w:t>И.И.</w:t>
                       </w:r>
                       <w:proofErr w:type="gramEnd"/>
                     </w:p>
                     <w:p>
                       <w:pPr>
                         <w:rPr>
-                          <w:b/>
-                          <w:bCs/>
+                          <w:lang w:val="en-US"/>
                         </w:rPr>
                       </w:pPr>
                     </w:p>
                   </w:txbxContent>
                 </v:textbox>
                 <w10:wrap anchorx="margin"/>
-              </v:rect>
+              </v:shape>
             </w:pict>
           </mc:Fallback>
         </mc:AlternateContent>
@@ -943,10 +476,10 @@
           <w:noProof/>
         </w:rPr>
         <w:drawing>
-          <wp:inline distT="0" distB="0" distL="0" distR="0" wp14:anchorId="6D0C78EC" wp14:editId="1287D8B8">
-            <wp:extent cx="3124200" cy="2876550"/>
+          <wp:inline distT="0" distB="0" distL="0" distR="0" wp14:anchorId="092BE851" wp14:editId="3ED6A9BD">
+            <wp:extent cx="3124200" cy="2324100"/>
             <wp:effectExtent l="0" t="0" r="0" b="0"/>
-            <wp:docPr id="1" name="Рисунок 3"/>
+            <wp:docPr id="1151606003" name="Рисунок 4" descr="Изображение выглядит как текст, Шрифт, снимок экрана&#10;&#10;Контент, сгенерированный ИИ, может содержать ошибки."/>
             <wp:cNvGraphicFramePr>
               <a:graphicFrameLocks xmlns:a="http://schemas.openxmlformats.org/drawingml/2006/main" noChangeAspect="1"/>
             </wp:cNvGraphicFramePr>
@@ -954,7 +487,7 @@
               <a:graphicData uri="http://schemas.openxmlformats.org/drawingml/2006/picture">
                 <pic:pic xmlns:pic="http://schemas.openxmlformats.org/drawingml/2006/picture">
                   <pic:nvPicPr>
-                    <pic:cNvPr id="0" name="Рисунок 3"/>
+                    <pic:cNvPr id="1151606003" name="Рисунок 4" descr="Изображение выглядит как текст, Шрифт, снимок экрана&#10;&#10;Контент, сгенерированный ИИ, может содержать ошибки."/>
                     <pic:cNvPicPr>
                       <a:picLocks noChangeAspect="1" noChangeArrowheads="1"/>
                     </pic:cNvPicPr>
@@ -975,7 +508,7 @@
                   <pic:spPr bwMode="auto">
                     <a:xfrm>
                       <a:off x="0" y="0"/>
-                      <a:ext cx="3124200" cy="2876550"/>
+                      <a:ext cx="3124200" cy="2324100"/>
                     </a:xfrm>
                     <a:prstGeom prst="rect">
                       <a:avLst/>
@@ -992,6 +525,251 @@
         </w:drawing>
       </w:r>
     </w:p>
+    <w:tbl>
+      <w:tblPr>
+        <w:tblStyle w:val="aa"/>
+        <w:tblW w:w="0" w:type="auto"/>
+        <w:tblInd w:w="0" w:type="dxa"/>
+        <w:tblBorders>
+          <w:top w:val="none" w:sz="0" w:space="0" w:color="auto"/>
+          <w:left w:val="none" w:sz="0" w:space="0" w:color="auto"/>
+          <w:right w:val="none" w:sz="0" w:space="0" w:color="auto"/>
+        </w:tblBorders>
+        <w:tblLook w:val="04A0" w:firstRow="1" w:lastRow="0" w:firstColumn="1" w:lastColumn="0" w:noHBand="0" w:noVBand="1"/>
+      </w:tblPr>
+      <w:tblGrid>
+        <w:gridCol w:w="704"/>
+        <w:gridCol w:w="1559"/>
+        <w:gridCol w:w="426"/>
+        <w:gridCol w:w="2273"/>
+      </w:tblGrid>
+      <w:tr>
+        <w:tc>
+          <w:tcPr>
+            <w:tcW w:w="2263" w:type="dxa"/>
+            <w:gridSpan w:val="2"/>
+            <w:tcBorders>
+              <w:top w:val="nil"/>
+              <w:left w:val="nil"/>
+              <w:right w:val="nil"/>
+            </w:tcBorders>
+            <w:vAlign w:val="center"/>
+          </w:tcPr>
+          <w:p>
+            <w:pPr>
+              <w:jc w:val="center"/>
+              <w:rPr>
+                <w:noProof/>
+              </w:rPr>
+            </w:pPr>
+            <w:r>
+              <w:rPr>
+                <w:noProof/>
+              </w:rPr>
+              <w:t>2</w:t>
+            </w:r>
+            <w:r>
+              <w:rPr>
+                <w:noProof/>
+                <w:lang w:val="en-US"/>
+              </w:rPr>
+              <w:t>6</w:t>
+            </w:r>
+            <w:r>
+              <w:rPr>
+                <w:noProof/>
+              </w:rPr>
+              <w:t>.</w:t>
+            </w:r>
+            <w:r>
+              <w:rPr>
+                <w:noProof/>
+                <w:lang w:val="en-US"/>
+              </w:rPr>
+              <w:t>03</w:t>
+            </w:r>
+            <w:r>
+              <w:rPr>
+                <w:noProof/>
+              </w:rPr>
+              <w:t>.20</w:t>
+            </w:r>
+            <w:r>
+              <w:rPr>
+                <w:noProof/>
+                <w:lang w:val="en-US"/>
+              </w:rPr>
+              <w:t>25</w:t>
+            </w:r>
+          </w:p>
+        </w:tc>
+        <w:tc>
+          <w:tcPr>
+            <w:tcW w:w="426" w:type="dxa"/>
+            <w:tcBorders>
+              <w:top w:val="nil"/>
+              <w:left w:val="nil"/>
+              <w:bottom w:val="nil"/>
+              <w:right w:val="nil"/>
+            </w:tcBorders>
+            <w:vAlign w:val="bottom"/>
+          </w:tcPr>
+          <w:p>
+            <w:pPr>
+              <w:jc w:val="center"/>
+              <w:rPr>
+                <w:noProof/>
+              </w:rPr>
+            </w:pPr>
+            <w:r>
+              <w:rPr>
+                <w:noProof/>
+                <w:sz w:val="20"/>
+                <w:szCs w:val="20"/>
+              </w:rPr>
+              <w:t>№</w:t>
+            </w:r>
+          </w:p>
+        </w:tc>
+        <w:tc>
+          <w:tcPr>
+            <w:tcW w:w="2273" w:type="dxa"/>
+            <w:tcBorders>
+              <w:top w:val="nil"/>
+              <w:left w:val="nil"/>
+              <w:bottom w:val="single" w:sz="4" w:space="0" w:color="auto"/>
+              <w:right w:val="nil"/>
+            </w:tcBorders>
+            <w:vAlign w:val="center"/>
+          </w:tcPr>
+          <w:p>
+            <w:pPr>
+              <w:jc w:val="center"/>
+              <w:rPr>
+                <w:noProof/>
+              </w:rPr>
+            </w:pPr>
+            <w:r>
+              <w:rPr>
+                <w:noProof/>
+                <w:lang w:val="en-US"/>
+              </w:rPr>
+              <w:t>1</w:t>
+            </w:r>
+            <w:r>
+              <w:rPr>
+                <w:noProof/>
+              </w:rPr>
+              <w:t>111</w:t>
+            </w:r>
+          </w:p>
+        </w:tc>
+      </w:tr>
+      <w:tr>
+        <w:trPr>
+          <w:trHeight w:val="363"/>
+        </w:trPr>
+        <w:tc>
+          <w:tcPr>
+            <w:tcW w:w="704" w:type="dxa"/>
+            <w:tcBorders>
+              <w:top w:val="nil"/>
+              <w:left w:val="nil"/>
+              <w:bottom w:val="nil"/>
+              <w:right w:val="nil"/>
+            </w:tcBorders>
+            <w:vAlign w:val="bottom"/>
+          </w:tcPr>
+          <w:p>
+            <w:pPr>
+              <w:rPr>
+                <w:noProof/>
+              </w:rPr>
+            </w:pPr>
+            <w:r>
+              <w:rPr>
+                <w:noProof/>
+                <w:sz w:val="20"/>
+                <w:szCs w:val="20"/>
+              </w:rPr>
+              <w:t>на №</w:t>
+            </w:r>
+          </w:p>
+        </w:tc>
+        <w:tc>
+          <w:tcPr>
+            <w:tcW w:w="1559" w:type="dxa"/>
+            <w:tcBorders>
+              <w:left w:val="nil"/>
+              <w:right w:val="nil"/>
+            </w:tcBorders>
+            <w:vAlign w:val="center"/>
+          </w:tcPr>
+          <w:p>
+            <w:pPr>
+              <w:jc w:val="center"/>
+              <w:rPr>
+                <w:noProof/>
+              </w:rPr>
+            </w:pPr>
+          </w:p>
+        </w:tc>
+        <w:tc>
+          <w:tcPr>
+            <w:tcW w:w="426" w:type="dxa"/>
+            <w:tcBorders>
+              <w:top w:val="nil"/>
+              <w:left w:val="nil"/>
+              <w:bottom w:val="nil"/>
+              <w:right w:val="nil"/>
+            </w:tcBorders>
+            <w:vAlign w:val="bottom"/>
+          </w:tcPr>
+          <w:p>
+            <w:pPr>
+              <w:rPr>
+                <w:noProof/>
+              </w:rPr>
+            </w:pPr>
+            <w:r>
+              <w:rPr>
+                <w:noProof/>
+                <w:sz w:val="20"/>
+                <w:szCs w:val="20"/>
+              </w:rPr>
+              <w:t>о</w:t>
+            </w:r>
+            <w:r>
+              <w:rPr>
+                <w:noProof/>
+                <w:sz w:val="20"/>
+                <w:szCs w:val="20"/>
+              </w:rPr>
+              <w:t>т</w:t>
+            </w:r>
+          </w:p>
+        </w:tc>
+        <w:tc>
+          <w:tcPr>
+            <w:tcW w:w="2273" w:type="dxa"/>
+            <w:tcBorders>
+              <w:top w:val="single" w:sz="4" w:space="0" w:color="auto"/>
+              <w:left w:val="nil"/>
+              <w:right w:val="nil"/>
+            </w:tcBorders>
+            <w:vAlign w:val="center"/>
+          </w:tcPr>
+          <w:p>
+            <w:pPr>
+              <w:jc w:val="center"/>
+              <w:rPr>
+                <w:noProof/>
+              </w:rPr>
+            </w:pPr>
+          </w:p>
+        </w:tc>
+      </w:tr>
+    </w:tbl>
     <w:p>
       <w:pPr>
         <w:ind w:left="142"/>
@@ -999,167 +777,37 @@
           <w:noProof/>
         </w:rPr>
       </w:pPr>
+    </w:p>
+    <w:p>
+      <w:pPr>
+        <w:rPr>
+          <w:i/>
+          <w:sz w:val="22"/>
+          <w:szCs w:val="20"/>
+        </w:rPr>
+      </w:pPr>
       <w:r>
         <w:rPr>
-          <w:noProof/>
+          <w:sz w:val="22"/>
+          <w:szCs w:val="20"/>
         </w:rPr>
-        <mc:AlternateContent>
-          <mc:Choice Requires="wps">
-            <w:drawing>
-              <wp:anchor distT="0" distB="0" distL="114300" distR="114300" simplePos="0" relativeHeight="251656704" behindDoc="0" locked="0" layoutInCell="1" allowOverlap="1" wp14:anchorId="0091C7EA" wp14:editId="046DC682">
-                <wp:simplePos x="0" y="0"/>
-                <wp:positionH relativeFrom="margin">
-                  <wp:posOffset>-85725</wp:posOffset>
-                </wp:positionH>
-                <wp:positionV relativeFrom="paragraph">
-                  <wp:posOffset>126365</wp:posOffset>
-                </wp:positionV>
-                <wp:extent cx="2819400" cy="259080"/>
-                <wp:effectExtent l="0" t="0" r="0" b="7620"/>
-                <wp:wrapNone/>
-                <wp:docPr id="2" name="Text Box 2"/>
-                <wp:cNvGraphicFramePr>
-                  <a:graphicFrameLocks xmlns:a="http://schemas.openxmlformats.org/drawingml/2006/main"/>
-                </wp:cNvGraphicFramePr>
-                <a:graphic xmlns:a="http://schemas.openxmlformats.org/drawingml/2006/main">
-                  <a:graphicData uri="http://schemas.microsoft.com/office/word/2010/wordprocessingShape">
-                    <wps:wsp>
-                      <wps:cNvSpPr txBox="1">
-                        <a:spLocks noChangeArrowheads="1"/>
-                      </wps:cNvSpPr>
-                      <wps:spPr bwMode="auto">
-                        <a:xfrm>
-                          <a:off x="0" y="0"/>
-                          <a:ext cx="2819400" cy="259080"/>
-                        </a:xfrm>
-                        <a:prstGeom prst="rect">
-                          <a:avLst/>
-                        </a:prstGeom>
-                        <a:noFill/>
-                        <a:ln>
-                          <a:noFill/>
-                        </a:ln>
-                        <a:extLst>
-                          <a:ext uri="{909E8E84-426E-40DD-AFC4-6F175D3DCCD1}">
-                            <a14:hiddenFill xmlns:a14="http://schemas.microsoft.com/office/drawing/2010/main">
-                              <a:solidFill>
-                                <a:srgbClr val="FFFFFF"/>
-                              </a:solidFill>
-                            </a14:hiddenFill>
-                          </a:ext>
-                          <a:ext uri="{91240B29-F687-4F45-9708-019B960494DF}">
-                            <a14:hiddenLine xmlns:a14="http://schemas.microsoft.com/office/drawing/2010/main" w="9525">
-                              <a:solidFill>
-                                <a:srgbClr val="000000"/>
-                              </a:solidFill>
-                              <a:miter lim="800000"/>
-                              <a:headEnd/>
-                              <a:tailEnd/>
-                            </a14:hiddenLine>
-                          </a:ext>
-                        </a:extLst>
-                      </wps:spPr>
-                      <wps:txbx>
-                        <w:txbxContent>
-                          <w:p>
-                            <w:pPr>
-                              <w:rPr>
-                                <w:i/>
-                                <w:sz w:val="22"/>
-                                <w:szCs w:val="20"/>
-                              </w:rPr>
-                            </w:pPr>
-                            <w:r>
-                              <w:rPr>
-                                <w:sz w:val="22"/>
-                                <w:szCs w:val="20"/>
-                              </w:rPr>
-                              <w:t>&lt;</w:t>
-                            </w:r>
-                            <w:r>
-                              <w:rPr>
-                                <w:i/>
-                                <w:sz w:val="22"/>
-                                <w:szCs w:val="20"/>
-                              </w:rPr>
-                              <w:t>О представлении документации</w:t>
-                            </w:r>
-                            <w:r>
-                              <w:rPr>
-                                <w:sz w:val="22"/>
-                                <w:szCs w:val="20"/>
-                              </w:rPr>
-                              <w:t>&gt;</w:t>
-                            </w:r>
-                          </w:p>
-                          <w:p/>
-                        </w:txbxContent>
-                      </wps:txbx>
-                      <wps:bodyPr rot="0" vert="horz" wrap="square" lIns="91440" tIns="45720" rIns="91440" bIns="45720" anchor="t" anchorCtr="0" upright="1">
-                        <a:noAutofit/>
-                      </wps:bodyPr>
-                    </wps:wsp>
-                  </a:graphicData>
-                </a:graphic>
-                <wp14:sizeRelH relativeFrom="page">
-                  <wp14:pctWidth>0</wp14:pctWidth>
-                </wp14:sizeRelH>
-                <wp14:sizeRelV relativeFrom="page">
-                  <wp14:pctHeight>0</wp14:pctHeight>
-                </wp14:sizeRelV>
-              </wp:anchor>
-            </w:drawing>
-          </mc:Choice>
-          <mc:Fallback>
-            <w:pict>
-              <v:shape w14:anchorId="0091C7EA" id="Text Box 2" o:spid="_x0000_s1028" type="#_x0000_t202" style="position:absolute;left:0;text-align:left;margin-left:-6.75pt;margin-top:9.95pt;width:222pt;height:20.4pt;z-index:251656704;visibility:visible;mso-wrap-style:square;mso-width-percent:0;mso-height-percent:0;mso-wrap-distance-left:9pt;mso-wrap-distance-top:0;mso-wrap-distance-right:9pt;mso-wrap-distance-bottom:0;mso-position-horizontal:absolute;mso-position-horizontal-relative:margin;mso-position-vertical:absolute;mso-position-vertical-relative:text;mso-width-percent:0;mso-height-percent:0;mso-width-relative:page;mso-height-relative:page;v-text-anchor:top" o:gfxdata="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" filled="f" stroked="f">
-                <v:textbox>
-                  <w:txbxContent>
-                    <w:p>
-                      <w:pPr>
-                        <w:rPr>
-                          <w:i/>
-                          <w:sz w:val="22"/>
-                          <w:szCs w:val="20"/>
-                        </w:rPr>
-                      </w:pPr>
-                      <w:r>
-                        <w:rPr>
-                          <w:sz w:val="22"/>
-                          <w:szCs w:val="20"/>
-                        </w:rPr>
-                        <w:t>&lt;</w:t>
-                      </w:r>
-                      <w:r>
-                        <w:rPr>
-                          <w:i/>
-                          <w:sz w:val="22"/>
-                          <w:szCs w:val="20"/>
-                        </w:rPr>
-                        <w:t>О представлении документации</w:t>
-                      </w:r>
-                      <w:r>
-                        <w:rPr>
-                          <w:sz w:val="22"/>
-                          <w:szCs w:val="20"/>
-                        </w:rPr>
-                        <w:t>&gt;</w:t>
-                      </w:r>
-                    </w:p>
-                    <w:p/>
-                  </w:txbxContent>
-                </v:textbox>
-                <w10:wrap anchorx="margin"/>
-              </v:shape>
-            </w:pict>
-          </mc:Fallback>
-        </mc:AlternateContent>
+        <w:t>&lt;</w:t>
       </w:r>
-    </w:p>
-    <w:p>
-      <w:pPr>
-        <w:ind w:left="142"/>
-      </w:pPr>
+      <w:r>
+        <w:rPr>
+          <w:i/>
+          <w:sz w:val="22"/>
+          <w:szCs w:val="20"/>
+        </w:rPr>
+        <w:t>О представлении документации</w:t>
+      </w:r>
+      <w:r>
+        <w:rPr>
+          <w:sz w:val="22"/>
+          <w:szCs w:val="20"/>
+        </w:rPr>
+        <w:t>&gt;</w:t>
+      </w:r>
     </w:p>
     <w:p>
       <w:pPr>
@@ -1188,7 +836,6 @@
       <w:r>
         <w:rPr>
           <w:b/>
-          <w:lang w:val="en-US"/>
         </w:rPr>
         <w:t xml:space="preserve"> </w:t>
       </w:r>
@@ -4393,6 +4040,7 @@
     <w:lsdException w:name="Table Web 1" w:semiHidden="1" w:unhideWhenUsed="1"/>
     <w:lsdException w:name="Table Web 2" w:semiHidden="1" w:unhideWhenUsed="1"/>
     <w:lsdException w:name="Table Web 3" w:semiHidden="1" w:unhideWhenUsed="1"/>
+    <w:lsdException w:name="Table Grid" w:uiPriority="39"/>
     <w:lsdException w:name="Table Theme" w:semiHidden="1" w:unhideWhenUsed="1"/>
     <w:lsdException w:name="Placeholder Text" w:semiHidden="1" w:uiPriority="99"/>
     <w:lsdException w:name="No Spacing" w:uiPriority="1" w:qFormat="1"/>
@@ -4618,7 +4266,7 @@
   <w:style w:type="paragraph" w:default="1" w:styleId="a0">
     <w:name w:val="Normal"/>
     <w:qFormat/>
-    <w:rsid w:val="0033710B"/>
+    <w:rsid w:val="004407D4"/>
     <w:rPr>
       <w:rFonts w:eastAsia="Calibri"/>
       <w:color w:val="000000"/>
@@ -4791,6 +4439,7 @@
   <w:style w:type="table" w:styleId="aa">
     <w:name w:val="Table Grid"/>
     <w:basedOn w:val="a2"/>
+    <w:uiPriority w:val="39"/>
     <w:rsid w:val="00C46095"/>
     <w:tblPr>
       <w:tblInd w:w="0" w:type="nil"/>

</xml_diff>

<commit_message>
docx with editing function
</commit_message>
<xml_diff>
--- a/templates/template.docx
+++ b/templates/template.docx
@@ -14,13 +14,13 @@
         <mc:AlternateContent>
           <mc:Choice Requires="wps">
             <w:drawing>
-              <wp:anchor distT="0" distB="0" distL="114300" distR="114300" simplePos="0" relativeHeight="251655679" behindDoc="0" locked="0" layoutInCell="1" allowOverlap="1" wp14:anchorId="119A1C16" wp14:editId="283FA565">
+              <wp:anchor distT="0" distB="0" distL="114300" distR="114300" simplePos="0" relativeHeight="251655679" behindDoc="0" locked="0" layoutInCell="1" allowOverlap="1" wp14:anchorId="119A1C16" wp14:editId="17ADCF8B">
                 <wp:simplePos x="0" y="0"/>
                 <wp:positionH relativeFrom="margin">
-                  <wp:posOffset>3623310</wp:posOffset>
+                  <wp:posOffset>3604260</wp:posOffset>
                 </wp:positionH>
                 <wp:positionV relativeFrom="paragraph">
-                  <wp:posOffset>441960</wp:posOffset>
+                  <wp:posOffset>432435</wp:posOffset>
                 </wp:positionV>
                 <wp:extent cx="2973705" cy="2466975"/>
                 <wp:effectExtent l="0" t="0" r="0" b="9525"/>
@@ -267,7 +267,7 @@
                 <v:stroke joinstyle="miter"/>
                 <v:path gradientshapeok="t" o:connecttype="rect"/>
               </v:shapetype>
-              <v:shape id="Надпись 3" o:spid="_x0000_s1026" type="#_x0000_t202" style="position:absolute;left:0;text-align:left;margin-left:285.3pt;margin-top:34.8pt;width:234.15pt;height:194.25pt;z-index:251655679;visibility:visible;mso-wrap-style:square;mso-width-percent:0;mso-height-percent:0;mso-wrap-distance-left:9pt;mso-wrap-distance-top:0;mso-wrap-distance-right:9pt;mso-wrap-distance-bottom:0;mso-position-horizontal:absolute;mso-position-horizontal-relative:margin;mso-position-vertical:absolute;mso-position-vertical-relative:text;mso-width-percent:0;mso-height-percent:0;mso-width-relative:margin;mso-height-relative:margin;v-text-anchor:top" o:gfxdata="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" fillcolor="white [3201]" stroked="f" strokeweight=".5pt">
+              <v:shape id="Надпись 3" o:spid="_x0000_s1026" type="#_x0000_t202" style="position:absolute;left:0;text-align:left;margin-left:283.8pt;margin-top:34.05pt;width:234.15pt;height:194.25pt;z-index:251655679;visibility:visible;mso-wrap-style:square;mso-width-percent:0;mso-height-percent:0;mso-wrap-distance-left:9pt;mso-wrap-distance-top:0;mso-wrap-distance-right:9pt;mso-wrap-distance-bottom:0;mso-position-horizontal:absolute;mso-position-horizontal-relative:margin;mso-position-vertical:absolute;mso-position-vertical-relative:text;mso-width-percent:0;mso-height-percent:0;mso-width-relative:margin;mso-height-relative:margin;v-text-anchor:top" o:gfxdata="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" fillcolor="white [3201]" stroked="f" strokeweight=".5pt">
                 <v:textbox>
                   <w:txbxContent>
                     <w:p>
@@ -476,9 +476,9 @@
           <w:noProof/>
         </w:rPr>
         <w:drawing>
-          <wp:inline distT="0" distB="0" distL="0" distR="0" wp14:anchorId="092BE851" wp14:editId="3ED6A9BD">
-            <wp:extent cx="3124200" cy="2324100"/>
-            <wp:effectExtent l="0" t="0" r="0" b="0"/>
+          <wp:inline distT="0" distB="0" distL="0" distR="0" wp14:anchorId="092BE851" wp14:editId="015D6052">
+            <wp:extent cx="3095625" cy="2302843"/>
+            <wp:effectExtent l="0" t="0" r="0" b="2540"/>
             <wp:docPr id="1151606003" name="Рисунок 4" descr="Изображение выглядит как текст, Шрифт, снимок экрана&#10;&#10;Контент, сгенерированный ИИ, может содержать ошибки."/>
             <wp:cNvGraphicFramePr>
               <a:graphicFrameLocks xmlns:a="http://schemas.openxmlformats.org/drawingml/2006/main" noChangeAspect="1"/>
@@ -508,7 +508,7 @@
                   <pic:spPr bwMode="auto">
                     <a:xfrm>
                       <a:off x="0" y="0"/>
-                      <a:ext cx="3124200" cy="2324100"/>
+                      <a:ext cx="3096655" cy="2303609"/>
                     </a:xfrm>
                     <a:prstGeom prst="rect">
                       <a:avLst/>
@@ -539,14 +539,14 @@
       </w:tblPr>
       <w:tblGrid>
         <w:gridCol w:w="704"/>
-        <w:gridCol w:w="1559"/>
-        <w:gridCol w:w="426"/>
-        <w:gridCol w:w="2273"/>
+        <w:gridCol w:w="1423"/>
+        <w:gridCol w:w="425"/>
+        <w:gridCol w:w="2073"/>
       </w:tblGrid>
       <w:tr>
         <w:tc>
           <w:tcPr>
-            <w:tcW w:w="2263" w:type="dxa"/>
+            <w:tcW w:w="2127" w:type="dxa"/>
             <w:gridSpan w:val="2"/>
             <w:tcBorders>
               <w:top w:val="nil"/>
@@ -560,52 +560,21 @@
               <w:jc w:val="center"/>
               <w:rPr>
                 <w:noProof/>
+                <w:lang w:val="en-US"/>
               </w:rPr>
             </w:pPr>
             <w:r>
               <w:rPr>
                 <w:noProof/>
-              </w:rPr>
-              <w:t>2</w:t>
-            </w:r>
-            <w:r>
-              <w:rPr>
-                <w:noProof/>
                 <w:lang w:val="en-US"/>
               </w:rPr>
-              <w:t>6</w:t>
-            </w:r>
-            <w:r>
-              <w:rPr>
-                <w:noProof/>
-              </w:rPr>
-              <w:t>.</w:t>
-            </w:r>
-            <w:r>
-              <w:rPr>
-                <w:noProof/>
-                <w:lang w:val="en-US"/>
-              </w:rPr>
-              <w:t>03</w:t>
-            </w:r>
-            <w:r>
-              <w:rPr>
-                <w:noProof/>
-              </w:rPr>
-              <w:t>.20</w:t>
-            </w:r>
-            <w:r>
-              <w:rPr>
-                <w:noProof/>
-                <w:lang w:val="en-US"/>
-              </w:rPr>
-              <w:t>25</w:t>
+              <w:t>{data_field}</w:t>
             </w:r>
           </w:p>
         </w:tc>
         <w:tc>
           <w:tcPr>
-            <w:tcW w:w="426" w:type="dxa"/>
+            <w:tcW w:w="425" w:type="dxa"/>
             <w:tcBorders>
               <w:top w:val="nil"/>
               <w:left w:val="nil"/>
@@ -633,7 +602,7 @@
         </w:tc>
         <w:tc>
           <w:tcPr>
-            <w:tcW w:w="2273" w:type="dxa"/>
+            <w:tcW w:w="1701" w:type="dxa"/>
             <w:tcBorders>
               <w:top w:val="nil"/>
               <w:left w:val="nil"/>
@@ -647,6 +616,7 @@
               <w:jc w:val="center"/>
               <w:rPr>
                 <w:noProof/>
+                <w:lang w:val="en-US"/>
               </w:rPr>
             </w:pPr>
             <w:r>
@@ -654,13 +624,7 @@
                 <w:noProof/>
                 <w:lang w:val="en-US"/>
               </w:rPr>
-              <w:t>1</w:t>
-            </w:r>
-            <w:r>
-              <w:rPr>
-                <w:noProof/>
-              </w:rPr>
-              <w:t>111</w:t>
+              <w:t>{contract_number}</w:t>
             </w:r>
           </w:p>
         </w:tc>
@@ -698,7 +662,7 @@
         </w:tc>
         <w:tc>
           <w:tcPr>
-            <w:tcW w:w="1559" w:type="dxa"/>
+            <w:tcW w:w="1423" w:type="dxa"/>
             <w:tcBorders>
               <w:left w:val="nil"/>
               <w:right w:val="nil"/>
@@ -716,7 +680,7 @@
         </w:tc>
         <w:tc>
           <w:tcPr>
-            <w:tcW w:w="426" w:type="dxa"/>
+            <w:tcW w:w="425" w:type="dxa"/>
             <w:tcBorders>
               <w:top w:val="nil"/>
               <w:left w:val="nil"/>
@@ -751,7 +715,7 @@
         </w:tc>
         <w:tc>
           <w:tcPr>
-            <w:tcW w:w="2273" w:type="dxa"/>
+            <w:tcW w:w="1701" w:type="dxa"/>
             <w:tcBorders>
               <w:top w:val="single" w:sz="4" w:space="0" w:color="auto"/>
               <w:left w:val="nil"/>
@@ -1198,9 +1162,12 @@
       <w:pPr>
         <w:spacing w:line="14" w:lineRule="atLeast"/>
         <w:sectPr>
-          <w:footerReference w:type="even" r:id="rId9"/>
-          <w:footerReference w:type="default" r:id="rId10"/>
-          <w:footerReference w:type="first" r:id="rId11"/>
+          <w:headerReference w:type="even" r:id="rId9"/>
+          <w:headerReference w:type="default" r:id="rId10"/>
+          <w:footerReference w:type="even" r:id="rId11"/>
+          <w:footerReference w:type="default" r:id="rId12"/>
+          <w:headerReference w:type="first" r:id="rId13"/>
+          <w:footerReference w:type="first" r:id="rId14"/>
           <w:pgSz w:w="11906" w:h="16838"/>
           <w:pgMar w:top="1134" w:right="567" w:bottom="1134" w:left="1134" w:header="709" w:footer="709" w:gutter="0"/>
           <w:cols w:space="708"/>
@@ -1211,7 +1178,7 @@
     </w:p>
     <w:p/>
     <w:sectPr>
-      <w:footerReference w:type="first" r:id="rId12"/>
+      <w:footerReference w:type="first" r:id="rId15"/>
       <w:pgSz w:w="11906" w:h="16838"/>
       <w:pgMar w:top="567" w:right="849" w:bottom="567" w:left="1134" w:header="709" w:footer="709" w:gutter="0"/>
       <w:cols w:space="708"/>
@@ -1482,48 +1449,35 @@
   <w:p>
     <w:pPr>
       <w:pStyle w:val="af3"/>
+      <w:rPr>
+        <w:lang w:val="en-US"/>
+      </w:rPr>
     </w:pPr>
     <w:r>
       <w:rPr>
         <w:sz w:val="16"/>
         <w:szCs w:val="16"/>
-      </w:rPr>
-      <w:t>2</w:t>
+        <w:lang w:val="en-US"/>
+      </w:rPr>
+      <w:t>{</w:t>
     </w:r>
+    <w:proofErr w:type="spellStart"/>
     <w:r>
       <w:rPr>
         <w:sz w:val="16"/>
         <w:szCs w:val="16"/>
-      </w:rPr>
-      <w:t>6</w:t>
+        <w:lang w:val="en-US"/>
+      </w:rPr>
+      <w:t>data_field</w:t>
     </w:r>
+    <w:proofErr w:type="spellEnd"/>
     <w:r>
       <w:rPr>
         <w:sz w:val="16"/>
         <w:szCs w:val="16"/>
-      </w:rPr>
-      <w:t>.</w:t>
-    </w:r>
-    <w:r>
-      <w:rPr>
-        <w:sz w:val="16"/>
-        <w:szCs w:val="16"/>
-      </w:rPr>
-      <w:t>03</w:t>
-    </w:r>
-    <w:r>
-      <w:rPr>
-        <w:sz w:val="16"/>
-        <w:szCs w:val="16"/>
-      </w:rPr>
-      <w:t>.202</w:t>
-    </w:r>
-    <w:r>
-      <w:rPr>
-        <w:sz w:val="16"/>
-        <w:szCs w:val="16"/>
-      </w:rPr>
-      <w:t>5</w:t>
+        <w:lang w:val="en-US"/>
+      </w:rPr>
+      <w:t>}</w:t>
     </w:r>
   </w:p>
 </w:ftr>
@@ -1546,6 +1500,36 @@
     </w:p>
   </w:footnote>
 </w:footnotes>
+</file>
+
+<file path=word/header1.xml><?xml version="1.0" encoding="utf-8"?>
+<w:hdr xmlns:wpc="http://schemas.microsoft.com/office/word/2010/wordprocessingCanvas" xmlns:cx="http://schemas.microsoft.com/office/drawing/2014/chartex" xmlns:cx1="http://schemas.microsoft.com/office/drawing/2015/9/8/chartex" xmlns:cx2="http://schemas.microsoft.com/office/drawing/2015/10/21/chartex" xmlns:cx3="http://schemas.microsoft.com/office/drawing/2016/5/9/chartex" xmlns:cx4="http://schemas.microsoft.com/office/drawing/2016/5/10/chartex" xmlns:cx5="http://schemas.microsoft.com/office/drawing/2016/5/11/chartex" xmlns:cx6="http://schemas.microsoft.com/office/drawing/2016/5/12/chartex" xmlns:cx7="http://schemas.microsoft.com/office/drawing/2016/5/13/chartex" xmlns:cx8="http://schemas.microsoft.com/office/drawing/2016/5/14/chartex" xmlns:mc="http://schemas.openxmlformats.org/markup-compatibility/2006" xmlns:aink="http://schemas.microsoft.com/office/drawing/2016/ink" xmlns:am3d="http://schemas.microsoft.com/office/drawing/2017/model3d" xmlns:o="urn:schemas-microsoft-com:office:office" xmlns:oel="http://schemas.microsoft.com/office/2019/extlst" xmlns:r="http://schemas.openxmlformats.org/officeDocument/2006/relationships" xmlns:m="http://schemas.openxmlformats.org/officeDocument/2006/math" xmlns:v="urn:schemas-microsoft-com:vml" xmlns:wp14="http://schemas.microsoft.com/office/word/2010/wordprocessingDrawing" xmlns:wp="http://schemas.openxmlformats.org/drawingml/2006/wordprocessingDrawing" xmlns:w10="urn:schemas-microsoft-com:office:word" xmlns:w="http://schemas.openxmlformats.org/wordprocessingml/2006/main" xmlns:w14="http://schemas.microsoft.com/office/word/2010/wordml" xmlns:w15="http://schemas.microsoft.com/office/word/2012/wordml" xmlns:w16cex="http://schemas.microsoft.com/office/word/2018/wordml/cex" xmlns:w16cid="http://schemas.microsoft.com/office/word/2016/wordml/cid" xmlns:w16="http://schemas.microsoft.com/office/word/2018/wordml" xmlns:w16du="http://schemas.microsoft.com/office/word/2023/wordml/word16du" xmlns:w16sdtdh="http://schemas.microsoft.com/office/word/2020/wordml/sdtdatahash" xmlns:w16sdtfl="http://schemas.microsoft.com/office/word/2024/wordml/sdtformatlock" xmlns:w16se="http://schemas.microsoft.com/office/word/2015/wordml/symex" xmlns:wpg="http://schemas.microsoft.com/office/word/2010/wordprocessingGroup" xmlns:wpi="http://schemas.microsoft.com/office/word/2010/wordprocessingInk" xmlns:wne="http://schemas.microsoft.com/office/word/2006/wordml" xmlns:wps="http://schemas.microsoft.com/office/word/2010/wordprocessingShape" mc:Ignorable="w14 w15 w16se w16cid w16 w16cex w16sdtdh w16sdtfl w16du wp14">
+  <w:p>
+    <w:pPr>
+      <w:pStyle w:val="af1"/>
+    </w:pPr>
+  </w:p>
+</w:hdr>
+</file>
+
+<file path=word/header2.xml><?xml version="1.0" encoding="utf-8"?>
+<w:hdr xmlns:wpc="http://schemas.microsoft.com/office/word/2010/wordprocessingCanvas" xmlns:cx="http://schemas.microsoft.com/office/drawing/2014/chartex" xmlns:cx1="http://schemas.microsoft.com/office/drawing/2015/9/8/chartex" xmlns:cx2="http://schemas.microsoft.com/office/drawing/2015/10/21/chartex" xmlns:cx3="http://schemas.microsoft.com/office/drawing/2016/5/9/chartex" xmlns:cx4="http://schemas.microsoft.com/office/drawing/2016/5/10/chartex" xmlns:cx5="http://schemas.microsoft.com/office/drawing/2016/5/11/chartex" xmlns:cx6="http://schemas.microsoft.com/office/drawing/2016/5/12/chartex" xmlns:cx7="http://schemas.microsoft.com/office/drawing/2016/5/13/chartex" xmlns:cx8="http://schemas.microsoft.com/office/drawing/2016/5/14/chartex" xmlns:mc="http://schemas.openxmlformats.org/markup-compatibility/2006" xmlns:aink="http://schemas.microsoft.com/office/drawing/2016/ink" xmlns:am3d="http://schemas.microsoft.com/office/drawing/2017/model3d" xmlns:o="urn:schemas-microsoft-com:office:office" xmlns:oel="http://schemas.microsoft.com/office/2019/extlst" xmlns:r="http://schemas.openxmlformats.org/officeDocument/2006/relationships" xmlns:m="http://schemas.openxmlformats.org/officeDocument/2006/math" xmlns:v="urn:schemas-microsoft-com:vml" xmlns:wp14="http://schemas.microsoft.com/office/word/2010/wordprocessingDrawing" xmlns:wp="http://schemas.openxmlformats.org/drawingml/2006/wordprocessingDrawing" xmlns:w10="urn:schemas-microsoft-com:office:word" xmlns:w="http://schemas.openxmlformats.org/wordprocessingml/2006/main" xmlns:w14="http://schemas.microsoft.com/office/word/2010/wordml" xmlns:w15="http://schemas.microsoft.com/office/word/2012/wordml" xmlns:w16cex="http://schemas.microsoft.com/office/word/2018/wordml/cex" xmlns:w16cid="http://schemas.microsoft.com/office/word/2016/wordml/cid" xmlns:w16="http://schemas.microsoft.com/office/word/2018/wordml" xmlns:w16du="http://schemas.microsoft.com/office/word/2023/wordml/word16du" xmlns:w16sdtdh="http://schemas.microsoft.com/office/word/2020/wordml/sdtdatahash" xmlns:w16sdtfl="http://schemas.microsoft.com/office/word/2024/wordml/sdtformatlock" xmlns:w16se="http://schemas.microsoft.com/office/word/2015/wordml/symex" xmlns:wpg="http://schemas.microsoft.com/office/word/2010/wordprocessingGroup" xmlns:wpi="http://schemas.microsoft.com/office/word/2010/wordprocessingInk" xmlns:wne="http://schemas.microsoft.com/office/word/2006/wordml" xmlns:wps="http://schemas.microsoft.com/office/word/2010/wordprocessingShape" mc:Ignorable="w14 w15 w16se w16cid w16 w16cex w16sdtdh w16sdtfl w16du wp14">
+  <w:p>
+    <w:pPr>
+      <w:pStyle w:val="af1"/>
+    </w:pPr>
+  </w:p>
+</w:hdr>
+</file>
+
+<file path=word/header3.xml><?xml version="1.0" encoding="utf-8"?>
+<w:hdr xmlns:wpc="http://schemas.microsoft.com/office/word/2010/wordprocessingCanvas" xmlns:cx="http://schemas.microsoft.com/office/drawing/2014/chartex" xmlns:cx1="http://schemas.microsoft.com/office/drawing/2015/9/8/chartex" xmlns:cx2="http://schemas.microsoft.com/office/drawing/2015/10/21/chartex" xmlns:cx3="http://schemas.microsoft.com/office/drawing/2016/5/9/chartex" xmlns:cx4="http://schemas.microsoft.com/office/drawing/2016/5/10/chartex" xmlns:cx5="http://schemas.microsoft.com/office/drawing/2016/5/11/chartex" xmlns:cx6="http://schemas.microsoft.com/office/drawing/2016/5/12/chartex" xmlns:cx7="http://schemas.microsoft.com/office/drawing/2016/5/13/chartex" xmlns:cx8="http://schemas.microsoft.com/office/drawing/2016/5/14/chartex" xmlns:mc="http://schemas.openxmlformats.org/markup-compatibility/2006" xmlns:aink="http://schemas.microsoft.com/office/drawing/2016/ink" xmlns:am3d="http://schemas.microsoft.com/office/drawing/2017/model3d" xmlns:o="urn:schemas-microsoft-com:office:office" xmlns:oel="http://schemas.microsoft.com/office/2019/extlst" xmlns:r="http://schemas.openxmlformats.org/officeDocument/2006/relationships" xmlns:m="http://schemas.openxmlformats.org/officeDocument/2006/math" xmlns:v="urn:schemas-microsoft-com:vml" xmlns:wp14="http://schemas.microsoft.com/office/word/2010/wordprocessingDrawing" xmlns:wp="http://schemas.openxmlformats.org/drawingml/2006/wordprocessingDrawing" xmlns:w10="urn:schemas-microsoft-com:office:word" xmlns:w="http://schemas.openxmlformats.org/wordprocessingml/2006/main" xmlns:w14="http://schemas.microsoft.com/office/word/2010/wordml" xmlns:w15="http://schemas.microsoft.com/office/word/2012/wordml" xmlns:w16cex="http://schemas.microsoft.com/office/word/2018/wordml/cex" xmlns:w16cid="http://schemas.microsoft.com/office/word/2016/wordml/cid" xmlns:w16="http://schemas.microsoft.com/office/word/2018/wordml" xmlns:w16du="http://schemas.microsoft.com/office/word/2023/wordml/word16du" xmlns:w16sdtdh="http://schemas.microsoft.com/office/word/2020/wordml/sdtdatahash" xmlns:w16sdtfl="http://schemas.microsoft.com/office/word/2024/wordml/sdtformatlock" xmlns:w16se="http://schemas.microsoft.com/office/word/2015/wordml/symex" xmlns:wpg="http://schemas.microsoft.com/office/word/2010/wordprocessingGroup" xmlns:wpi="http://schemas.microsoft.com/office/word/2010/wordprocessingInk" xmlns:wne="http://schemas.microsoft.com/office/word/2006/wordml" xmlns:wps="http://schemas.microsoft.com/office/word/2010/wordprocessingShape" mc:Ignorable="w14 w15 w16se w16cid w16 w16cex w16sdtdh w16sdtfl w16du wp14">
+  <w:p>
+    <w:pPr>
+      <w:pStyle w:val="af1"/>
+    </w:pPr>
+  </w:p>
+</w:hdr>
 </file>
 
 <file path=word/numbering.xml><?xml version="1.0" encoding="utf-8"?>

</xml_diff>